<commit_message>
usecase loutout e UC4 modificati leggermente
</commit_message>
<xml_diff>
--- a/Documents/Casi d'uso.docx
+++ b/Documents/Casi d'uso.docx
@@ -926,13 +926,36 @@
     <w:p>
       <w:r>
         <w:rPr>
-          <w:b/>
-          <w:bCs/>
-        </w:rPr>
-        <w:t>Entry condition:</w:t>
-      </w:r>
-      <w:r>
-        <w:t xml:space="preserve"> Il lettore è autenticato.</w:t>
+          <w:b w:val="1"/>
+          <w:bCs w:val="1"/>
+        </w:rPr>
+        <w:t xml:space="preserve">Entry </w:t>
+      </w:r>
+      <w:r>
+        <w:rPr>
+          <w:b w:val="1"/>
+          <w:bCs w:val="1"/>
+        </w:rPr>
+        <w:t>condition</w:t>
+      </w:r>
+      <w:r>
+        <w:rPr>
+          <w:b w:val="1"/>
+          <w:bCs w:val="1"/>
+        </w:rPr>
+        <w:t>:</w:t>
+      </w:r>
+      <w:r>
+        <w:rPr/>
+        <w:t xml:space="preserve"> Il lettore è autenticato</w:t>
+      </w:r>
+      <w:r>
+        <w:rPr/>
+        <w:t xml:space="preserve"> ed è sulla pagina del suo profilo</w:t>
+      </w:r>
+      <w:r>
+        <w:rPr/>
+        <w:t>.</w:t>
       </w:r>
     </w:p>
     <w:p>
@@ -1160,29 +1183,55 @@
     <w:p>
       <w:r>
         <w:rPr>
-          <w:b/>
-          <w:bCs/>
-        </w:rPr>
-        <w:t>Exit condition:</w:t>
-      </w:r>
-      <w:r>
-        <w:t xml:space="preserve"> Il sistema mostra i dettagli relativi all’edizione quali: autore, edizione, e numero di copie disponibili.</w:t>
-      </w:r>
-      <w:r>
-        <w:rPr>
-          <w:b/>
-          <w:bCs/>
+          <w:b w:val="1"/>
+          <w:bCs w:val="1"/>
+        </w:rPr>
+        <w:t xml:space="preserve">Exit </w:t>
+      </w:r>
+      <w:r>
+        <w:rPr>
+          <w:b w:val="1"/>
+          <w:bCs w:val="1"/>
+        </w:rPr>
+        <w:t>condition</w:t>
+      </w:r>
+      <w:r>
+        <w:rPr>
+          <w:b w:val="1"/>
+          <w:bCs w:val="1"/>
+        </w:rPr>
+        <w:t>:</w:t>
+      </w:r>
+      <w:r>
+        <w:rPr/>
+        <w:t xml:space="preserve"> Il sistema mostra i dettagli relativi all’edizione quali: autor</w:t>
+      </w:r>
+      <w:r>
+        <w:rPr/>
+        <w:t>i</w:t>
+      </w:r>
+      <w:r>
+        <w:rPr/>
+        <w:t xml:space="preserve">, edizione, e numero di copie </w:t>
+      </w:r>
+      <w:r>
+        <w:rPr/>
+        <w:t>disponibili.</w:t>
+      </w:r>
+      <w:r>
+        <w:rPr>
+          <w:b w:val="1"/>
+          <w:bCs w:val="1"/>
         </w:rPr>
         <w:br w:type="page"/>
       </w:r>
       <w:r>
         <w:rPr>
-          <w:b/>
-          <w:bCs/>
-          <w:sz w:val="28"/>
-          <w:szCs w:val="28"/>
-        </w:rPr>
-        <w:lastRenderedPageBreak/>
+          <w:b w:val="1"/>
+          <w:bCs w:val="1"/>
+          <w:sz w:val="28"/>
+          <w:szCs w:val="28"/>
+        </w:rPr>
         <w:t>UC5 – Prenotazione di un libro disponibile</w:t>
       </w:r>
     </w:p>
@@ -6624,7 +6673,7 @@
       </w:r>
     </w:p>
     <w:sectPr>
-      <w:pgSz w:w="11906" w:h="16838"/>
+      <w:pgSz w:w="11906" w:h="16838" w:orient="portrait"/>
       <w:pgMar w:top="1417" w:right="1134" w:bottom="1134" w:left="1134" w:header="708" w:footer="708" w:gutter="0"/>
       <w:cols w:space="708"/>
       <w:docGrid w:linePitch="360"/>
@@ -6733,7 +6782,7 @@
         <w:ind w:left="1068" w:hanging="360"/>
       </w:pPr>
       <w:rPr>
-        <w:rFonts w:ascii="Aptos" w:eastAsiaTheme="minorHAnsi" w:hAnsi="Aptos" w:cstheme="minorBidi" w:hint="default"/>
+        <w:rFonts w:hint="default" w:ascii="Aptos" w:hAnsi="Aptos" w:eastAsiaTheme="minorHAnsi" w:cstheme="minorBidi"/>
       </w:rPr>
     </w:lvl>
     <w:lvl w:ilvl="1">
@@ -6833,7 +6882,7 @@
         <w:ind w:left="1429" w:hanging="360"/>
       </w:pPr>
       <w:rPr>
-        <w:rFonts w:ascii="Aptos" w:eastAsiaTheme="minorHAnsi" w:hAnsi="Aptos" w:cstheme="minorBidi" w:hint="default"/>
+        <w:rFonts w:hint="default" w:ascii="Aptos" w:hAnsi="Aptos" w:eastAsiaTheme="minorHAnsi" w:cstheme="minorBidi"/>
       </w:rPr>
     </w:lvl>
     <w:lvl w:ilvl="2">
@@ -7379,7 +7428,7 @@
         <w:ind w:left="1440" w:hanging="360"/>
       </w:pPr>
       <w:rPr>
-        <w:rFonts w:ascii="Symbol" w:hAnsi="Symbol" w:hint="default"/>
+        <w:rFonts w:hint="default" w:ascii="Symbol" w:hAnsi="Symbol"/>
       </w:rPr>
     </w:lvl>
     <w:lvl w:ilvl="2" w:tplc="FFFFFFFF">
@@ -7470,7 +7519,7 @@
         <w:ind w:left="1429" w:hanging="360"/>
       </w:pPr>
       <w:rPr>
-        <w:rFonts w:ascii="Aptos" w:eastAsiaTheme="minorHAnsi" w:hAnsi="Aptos" w:cstheme="minorBidi" w:hint="default"/>
+        <w:rFonts w:hint="default" w:ascii="Aptos" w:hAnsi="Aptos" w:eastAsiaTheme="minorHAnsi" w:cstheme="minorBidi"/>
       </w:rPr>
     </w:lvl>
     <w:lvl w:ilvl="2">
@@ -7583,7 +7632,7 @@
         <w:ind w:left="1440" w:hanging="360"/>
       </w:pPr>
       <w:rPr>
-        <w:rFonts w:ascii="Symbol" w:hAnsi="Symbol" w:hint="default"/>
+        <w:rFonts w:hint="default" w:ascii="Symbol" w:hAnsi="Symbol"/>
       </w:rPr>
     </w:lvl>
     <w:lvl w:ilvl="2" w:tplc="0410001B">
@@ -7760,7 +7809,7 @@
         <w:ind w:left="1429" w:hanging="360"/>
       </w:pPr>
       <w:rPr>
-        <w:rFonts w:ascii="Aptos" w:eastAsiaTheme="minorHAnsi" w:hAnsi="Aptos" w:cstheme="minorBidi" w:hint="default"/>
+        <w:rFonts w:hint="default" w:ascii="Aptos" w:hAnsi="Aptos" w:eastAsiaTheme="minorHAnsi" w:cstheme="minorBidi"/>
       </w:rPr>
     </w:lvl>
     <w:lvl w:ilvl="2">
@@ -8127,7 +8176,7 @@
         <w:ind w:left="1429" w:hanging="360"/>
       </w:pPr>
       <w:rPr>
-        <w:rFonts w:ascii="Aptos" w:eastAsiaTheme="minorHAnsi" w:hAnsi="Aptos" w:cstheme="minorBidi" w:hint="default"/>
+        <w:rFonts w:hint="default" w:ascii="Aptos" w:hAnsi="Aptos" w:eastAsiaTheme="minorHAnsi" w:cstheme="minorBidi"/>
       </w:rPr>
     </w:lvl>
     <w:lvl w:ilvl="2">
@@ -8207,7 +8256,7 @@
         <w:ind w:left="1080" w:hanging="360"/>
       </w:pPr>
       <w:rPr>
-        <w:rFonts w:ascii="Aptos" w:eastAsiaTheme="minorHAnsi" w:hAnsi="Aptos" w:cstheme="minorBidi" w:hint="default"/>
+        <w:rFonts w:hint="default" w:ascii="Aptos" w:hAnsi="Aptos" w:eastAsiaTheme="minorHAnsi" w:cstheme="minorBidi"/>
       </w:rPr>
     </w:lvl>
     <w:lvl w:ilvl="1" w:tplc="04100003" w:tentative="1">
@@ -8219,7 +8268,7 @@
         <w:ind w:left="1800" w:hanging="360"/>
       </w:pPr>
       <w:rPr>
-        <w:rFonts w:ascii="Courier New" w:hAnsi="Courier New" w:cs="Courier New" w:hint="default"/>
+        <w:rFonts w:hint="default" w:ascii="Courier New" w:hAnsi="Courier New" w:cs="Courier New"/>
       </w:rPr>
     </w:lvl>
     <w:lvl w:ilvl="2" w:tplc="04100005" w:tentative="1">
@@ -8231,7 +8280,7 @@
         <w:ind w:left="2520" w:hanging="360"/>
       </w:pPr>
       <w:rPr>
-        <w:rFonts w:ascii="Wingdings" w:hAnsi="Wingdings" w:hint="default"/>
+        <w:rFonts w:hint="default" w:ascii="Wingdings" w:hAnsi="Wingdings"/>
       </w:rPr>
     </w:lvl>
     <w:lvl w:ilvl="3" w:tplc="04100001" w:tentative="1">
@@ -8243,7 +8292,7 @@
         <w:ind w:left="3240" w:hanging="360"/>
       </w:pPr>
       <w:rPr>
-        <w:rFonts w:ascii="Symbol" w:hAnsi="Symbol" w:hint="default"/>
+        <w:rFonts w:hint="default" w:ascii="Symbol" w:hAnsi="Symbol"/>
       </w:rPr>
     </w:lvl>
     <w:lvl w:ilvl="4" w:tplc="04100003" w:tentative="1">
@@ -8255,7 +8304,7 @@
         <w:ind w:left="3960" w:hanging="360"/>
       </w:pPr>
       <w:rPr>
-        <w:rFonts w:ascii="Courier New" w:hAnsi="Courier New" w:cs="Courier New" w:hint="default"/>
+        <w:rFonts w:hint="default" w:ascii="Courier New" w:hAnsi="Courier New" w:cs="Courier New"/>
       </w:rPr>
     </w:lvl>
     <w:lvl w:ilvl="5" w:tplc="04100005" w:tentative="1">
@@ -8267,7 +8316,7 @@
         <w:ind w:left="4680" w:hanging="360"/>
       </w:pPr>
       <w:rPr>
-        <w:rFonts w:ascii="Wingdings" w:hAnsi="Wingdings" w:hint="default"/>
+        <w:rFonts w:hint="default" w:ascii="Wingdings" w:hAnsi="Wingdings"/>
       </w:rPr>
     </w:lvl>
     <w:lvl w:ilvl="6" w:tplc="04100001" w:tentative="1">
@@ -8279,7 +8328,7 @@
         <w:ind w:left="5400" w:hanging="360"/>
       </w:pPr>
       <w:rPr>
-        <w:rFonts w:ascii="Symbol" w:hAnsi="Symbol" w:hint="default"/>
+        <w:rFonts w:hint="default" w:ascii="Symbol" w:hAnsi="Symbol"/>
       </w:rPr>
     </w:lvl>
     <w:lvl w:ilvl="7" w:tplc="04100003" w:tentative="1">
@@ -8291,7 +8340,7 @@
         <w:ind w:left="6120" w:hanging="360"/>
       </w:pPr>
       <w:rPr>
-        <w:rFonts w:ascii="Courier New" w:hAnsi="Courier New" w:cs="Courier New" w:hint="default"/>
+        <w:rFonts w:hint="default" w:ascii="Courier New" w:hAnsi="Courier New" w:cs="Courier New"/>
       </w:rPr>
     </w:lvl>
     <w:lvl w:ilvl="8" w:tplc="04100005" w:tentative="1">
@@ -8303,7 +8352,7 @@
         <w:ind w:left="6840" w:hanging="360"/>
       </w:pPr>
       <w:rPr>
-        <w:rFonts w:ascii="Wingdings" w:hAnsi="Wingdings" w:hint="default"/>
+        <w:rFonts w:hint="default" w:ascii="Wingdings" w:hAnsi="Wingdings"/>
       </w:rPr>
     </w:lvl>
   </w:abstractNum>
@@ -8749,7 +8798,7 @@
         <w:ind w:left="1069" w:hanging="360"/>
       </w:pPr>
       <w:rPr>
-        <w:rFonts w:ascii="Aptos" w:eastAsiaTheme="minorHAnsi" w:hAnsi="Aptos" w:cstheme="minorBidi" w:hint="default"/>
+        <w:rFonts w:hint="default" w:ascii="Aptos" w:hAnsi="Aptos" w:eastAsiaTheme="minorHAnsi" w:cstheme="minorBidi"/>
       </w:rPr>
     </w:lvl>
     <w:lvl w:ilvl="1" w:tplc="04100003" w:tentative="1">
@@ -8761,7 +8810,7 @@
         <w:ind w:left="1789" w:hanging="360"/>
       </w:pPr>
       <w:rPr>
-        <w:rFonts w:ascii="Courier New" w:hAnsi="Courier New" w:cs="Courier New" w:hint="default"/>
+        <w:rFonts w:hint="default" w:ascii="Courier New" w:hAnsi="Courier New" w:cs="Courier New"/>
       </w:rPr>
     </w:lvl>
     <w:lvl w:ilvl="2" w:tplc="04100005" w:tentative="1">
@@ -8773,7 +8822,7 @@
         <w:ind w:left="2509" w:hanging="360"/>
       </w:pPr>
       <w:rPr>
-        <w:rFonts w:ascii="Wingdings" w:hAnsi="Wingdings" w:hint="default"/>
+        <w:rFonts w:hint="default" w:ascii="Wingdings" w:hAnsi="Wingdings"/>
       </w:rPr>
     </w:lvl>
     <w:lvl w:ilvl="3" w:tplc="04100001" w:tentative="1">
@@ -8785,7 +8834,7 @@
         <w:ind w:left="3229" w:hanging="360"/>
       </w:pPr>
       <w:rPr>
-        <w:rFonts w:ascii="Symbol" w:hAnsi="Symbol" w:hint="default"/>
+        <w:rFonts w:hint="default" w:ascii="Symbol" w:hAnsi="Symbol"/>
       </w:rPr>
     </w:lvl>
     <w:lvl w:ilvl="4" w:tplc="04100003" w:tentative="1">
@@ -8797,7 +8846,7 @@
         <w:ind w:left="3949" w:hanging="360"/>
       </w:pPr>
       <w:rPr>
-        <w:rFonts w:ascii="Courier New" w:hAnsi="Courier New" w:cs="Courier New" w:hint="default"/>
+        <w:rFonts w:hint="default" w:ascii="Courier New" w:hAnsi="Courier New" w:cs="Courier New"/>
       </w:rPr>
     </w:lvl>
     <w:lvl w:ilvl="5" w:tplc="04100005" w:tentative="1">
@@ -8809,7 +8858,7 @@
         <w:ind w:left="4669" w:hanging="360"/>
       </w:pPr>
       <w:rPr>
-        <w:rFonts w:ascii="Wingdings" w:hAnsi="Wingdings" w:hint="default"/>
+        <w:rFonts w:hint="default" w:ascii="Wingdings" w:hAnsi="Wingdings"/>
       </w:rPr>
     </w:lvl>
     <w:lvl w:ilvl="6" w:tplc="04100001" w:tentative="1">
@@ -8821,7 +8870,7 @@
         <w:ind w:left="5389" w:hanging="360"/>
       </w:pPr>
       <w:rPr>
-        <w:rFonts w:ascii="Symbol" w:hAnsi="Symbol" w:hint="default"/>
+        <w:rFonts w:hint="default" w:ascii="Symbol" w:hAnsi="Symbol"/>
       </w:rPr>
     </w:lvl>
     <w:lvl w:ilvl="7" w:tplc="04100003" w:tentative="1">
@@ -8833,7 +8882,7 @@
         <w:ind w:left="6109" w:hanging="360"/>
       </w:pPr>
       <w:rPr>
-        <w:rFonts w:ascii="Courier New" w:hAnsi="Courier New" w:cs="Courier New" w:hint="default"/>
+        <w:rFonts w:hint="default" w:ascii="Courier New" w:hAnsi="Courier New" w:cs="Courier New"/>
       </w:rPr>
     </w:lvl>
     <w:lvl w:ilvl="8" w:tplc="04100005" w:tentative="1">
@@ -8845,7 +8894,7 @@
         <w:ind w:left="6829" w:hanging="360"/>
       </w:pPr>
       <w:rPr>
-        <w:rFonts w:ascii="Wingdings" w:hAnsi="Wingdings" w:hint="default"/>
+        <w:rFonts w:hint="default" w:ascii="Wingdings" w:hAnsi="Wingdings"/>
       </w:rPr>
     </w:lvl>
   </w:abstractNum>
@@ -9043,7 +9092,7 @@
         <w:ind w:left="1440" w:hanging="360"/>
       </w:pPr>
       <w:rPr>
-        <w:rFonts w:ascii="Symbol" w:hAnsi="Symbol" w:hint="default"/>
+        <w:rFonts w:hint="default" w:ascii="Symbol" w:hAnsi="Symbol"/>
       </w:rPr>
     </w:lvl>
     <w:lvl w:ilvl="2" w:tplc="FFFFFFFF" w:tentative="1">
@@ -9552,7 +9601,7 @@
         <w:ind w:left="1068" w:hanging="360"/>
       </w:pPr>
       <w:rPr>
-        <w:rFonts w:ascii="Aptos" w:eastAsiaTheme="minorHAnsi" w:hAnsi="Aptos" w:cstheme="minorBidi" w:hint="default"/>
+        <w:rFonts w:hint="default" w:ascii="Aptos" w:hAnsi="Aptos" w:eastAsiaTheme="minorHAnsi" w:cstheme="minorBidi"/>
       </w:rPr>
     </w:lvl>
     <w:lvl w:ilvl="1">
@@ -10618,7 +10667,7 @@
   <w:docDefaults>
     <w:rPrDefault>
       <w:rPr>
-        <w:rFonts w:asciiTheme="minorHAnsi" w:eastAsiaTheme="minorHAnsi" w:hAnsiTheme="minorHAnsi" w:cstheme="minorBidi"/>
+        <w:rFonts w:asciiTheme="minorHAnsi" w:hAnsiTheme="minorHAnsi" w:eastAsiaTheme="minorHAnsi" w:cstheme="minorBidi"/>
         <w:kern w:val="2"/>
         <w:sz w:val="24"/>
         <w:szCs w:val="24"/>
@@ -10635,14 +10684,14 @@
   <w:latentStyles w:defLockedState="0" w:defUIPriority="99" w:defSemiHidden="0" w:defUnhideWhenUsed="0" w:defQFormat="0" w:count="376">
     <w:lsdException w:name="Normal" w:uiPriority="0" w:qFormat="1"/>
     <w:lsdException w:name="heading 1" w:uiPriority="9" w:qFormat="1"/>
-    <w:lsdException w:name="heading 2" w:semiHidden="1" w:uiPriority="9" w:unhideWhenUsed="1" w:qFormat="1"/>
-    <w:lsdException w:name="heading 3" w:semiHidden="1" w:uiPriority="9" w:unhideWhenUsed="1" w:qFormat="1"/>
-    <w:lsdException w:name="heading 4" w:semiHidden="1" w:uiPriority="9" w:unhideWhenUsed="1" w:qFormat="1"/>
-    <w:lsdException w:name="heading 5" w:semiHidden="1" w:uiPriority="9" w:unhideWhenUsed="1" w:qFormat="1"/>
-    <w:lsdException w:name="heading 6" w:semiHidden="1" w:uiPriority="9" w:unhideWhenUsed="1" w:qFormat="1"/>
-    <w:lsdException w:name="heading 7" w:semiHidden="1" w:uiPriority="9" w:unhideWhenUsed="1" w:qFormat="1"/>
-    <w:lsdException w:name="heading 8" w:semiHidden="1" w:uiPriority="9" w:unhideWhenUsed="1" w:qFormat="1"/>
-    <w:lsdException w:name="heading 9" w:semiHidden="1" w:uiPriority="9" w:unhideWhenUsed="1" w:qFormat="1"/>
+    <w:lsdException w:name="heading 2" w:uiPriority="9" w:semiHidden="1" w:unhideWhenUsed="1" w:qFormat="1"/>
+    <w:lsdException w:name="heading 3" w:uiPriority="9" w:semiHidden="1" w:unhideWhenUsed="1" w:qFormat="1"/>
+    <w:lsdException w:name="heading 4" w:uiPriority="9" w:semiHidden="1" w:unhideWhenUsed="1" w:qFormat="1"/>
+    <w:lsdException w:name="heading 5" w:uiPriority="9" w:semiHidden="1" w:unhideWhenUsed="1" w:qFormat="1"/>
+    <w:lsdException w:name="heading 6" w:uiPriority="9" w:semiHidden="1" w:unhideWhenUsed="1" w:qFormat="1"/>
+    <w:lsdException w:name="heading 7" w:uiPriority="9" w:semiHidden="1" w:unhideWhenUsed="1" w:qFormat="1"/>
+    <w:lsdException w:name="heading 8" w:uiPriority="9" w:semiHidden="1" w:unhideWhenUsed="1" w:qFormat="1"/>
+    <w:lsdException w:name="heading 9" w:uiPriority="9" w:semiHidden="1" w:unhideWhenUsed="1" w:qFormat="1"/>
     <w:lsdException w:name="index 1" w:semiHidden="1" w:unhideWhenUsed="1"/>
     <w:lsdException w:name="index 2" w:semiHidden="1" w:unhideWhenUsed="1"/>
     <w:lsdException w:name="index 3" w:semiHidden="1" w:unhideWhenUsed="1"/>
@@ -10652,22 +10701,22 @@
     <w:lsdException w:name="index 7" w:semiHidden="1" w:unhideWhenUsed="1"/>
     <w:lsdException w:name="index 8" w:semiHidden="1" w:unhideWhenUsed="1"/>
     <w:lsdException w:name="index 9" w:semiHidden="1" w:unhideWhenUsed="1"/>
-    <w:lsdException w:name="toc 1" w:semiHidden="1" w:uiPriority="39" w:unhideWhenUsed="1"/>
-    <w:lsdException w:name="toc 2" w:semiHidden="1" w:uiPriority="39" w:unhideWhenUsed="1"/>
-    <w:lsdException w:name="toc 3" w:semiHidden="1" w:uiPriority="39" w:unhideWhenUsed="1"/>
-    <w:lsdException w:name="toc 4" w:semiHidden="1" w:uiPriority="39" w:unhideWhenUsed="1"/>
-    <w:lsdException w:name="toc 5" w:semiHidden="1" w:uiPriority="39" w:unhideWhenUsed="1"/>
-    <w:lsdException w:name="toc 6" w:semiHidden="1" w:uiPriority="39" w:unhideWhenUsed="1"/>
-    <w:lsdException w:name="toc 7" w:semiHidden="1" w:uiPriority="39" w:unhideWhenUsed="1"/>
-    <w:lsdException w:name="toc 8" w:semiHidden="1" w:uiPriority="39" w:unhideWhenUsed="1"/>
-    <w:lsdException w:name="toc 9" w:semiHidden="1" w:uiPriority="39" w:unhideWhenUsed="1"/>
+    <w:lsdException w:name="toc 1" w:uiPriority="39" w:semiHidden="1" w:unhideWhenUsed="1"/>
+    <w:lsdException w:name="toc 2" w:uiPriority="39" w:semiHidden="1" w:unhideWhenUsed="1"/>
+    <w:lsdException w:name="toc 3" w:uiPriority="39" w:semiHidden="1" w:unhideWhenUsed="1"/>
+    <w:lsdException w:name="toc 4" w:uiPriority="39" w:semiHidden="1" w:unhideWhenUsed="1"/>
+    <w:lsdException w:name="toc 5" w:uiPriority="39" w:semiHidden="1" w:unhideWhenUsed="1"/>
+    <w:lsdException w:name="toc 6" w:uiPriority="39" w:semiHidden="1" w:unhideWhenUsed="1"/>
+    <w:lsdException w:name="toc 7" w:uiPriority="39" w:semiHidden="1" w:unhideWhenUsed="1"/>
+    <w:lsdException w:name="toc 8" w:uiPriority="39" w:semiHidden="1" w:unhideWhenUsed="1"/>
+    <w:lsdException w:name="toc 9" w:uiPriority="39" w:semiHidden="1" w:unhideWhenUsed="1"/>
     <w:lsdException w:name="Normal Indent" w:semiHidden="1" w:unhideWhenUsed="1"/>
     <w:lsdException w:name="footnote text" w:semiHidden="1" w:unhideWhenUsed="1"/>
     <w:lsdException w:name="annotation text" w:semiHidden="1" w:unhideWhenUsed="1"/>
     <w:lsdException w:name="header" w:semiHidden="1" w:unhideWhenUsed="1"/>
     <w:lsdException w:name="footer" w:semiHidden="1" w:unhideWhenUsed="1"/>
     <w:lsdException w:name="index heading" w:semiHidden="1" w:unhideWhenUsed="1"/>
-    <w:lsdException w:name="caption" w:semiHidden="1" w:uiPriority="35" w:unhideWhenUsed="1" w:qFormat="1"/>
+    <w:lsdException w:name="caption" w:uiPriority="35" w:semiHidden="1" w:unhideWhenUsed="1" w:qFormat="1"/>
     <w:lsdException w:name="table of figures" w:semiHidden="1" w:unhideWhenUsed="1"/>
     <w:lsdException w:name="envelope address" w:semiHidden="1" w:unhideWhenUsed="1"/>
     <w:lsdException w:name="envelope return" w:semiHidden="1" w:unhideWhenUsed="1"/>
@@ -10698,7 +10747,7 @@
     <w:lsdException w:name="Title" w:uiPriority="10" w:qFormat="1"/>
     <w:lsdException w:name="Closing" w:semiHidden="1" w:unhideWhenUsed="1"/>
     <w:lsdException w:name="Signature" w:semiHidden="1" w:unhideWhenUsed="1"/>
-    <w:lsdException w:name="Default Paragraph Font" w:semiHidden="1" w:uiPriority="1" w:unhideWhenUsed="1"/>
+    <w:lsdException w:name="Default Paragraph Font" w:uiPriority="1" w:semiHidden="1" w:unhideWhenUsed="1"/>
     <w:lsdException w:name="Body Text" w:semiHidden="1" w:unhideWhenUsed="1"/>
     <w:lsdException w:name="Body Text Indent" w:semiHidden="1" w:unhideWhenUsed="1"/>
     <w:lsdException w:name="List Continue" w:semiHidden="1" w:unhideWhenUsed="1"/>
@@ -10898,8 +10947,8 @@
     <w:lsdException w:name="Subtle Reference" w:uiPriority="31" w:qFormat="1"/>
     <w:lsdException w:name="Intense Reference" w:uiPriority="32" w:qFormat="1"/>
     <w:lsdException w:name="Book Title" w:uiPriority="33" w:qFormat="1"/>
-    <w:lsdException w:name="Bibliography" w:semiHidden="1" w:uiPriority="37" w:unhideWhenUsed="1"/>
-    <w:lsdException w:name="TOC Heading" w:semiHidden="1" w:uiPriority="39" w:unhideWhenUsed="1" w:qFormat="1"/>
+    <w:lsdException w:name="Bibliography" w:uiPriority="37" w:semiHidden="1" w:unhideWhenUsed="1"/>
+    <w:lsdException w:name="TOC Heading" w:uiPriority="39" w:semiHidden="1" w:unhideWhenUsed="1" w:qFormat="1"/>
     <w:lsdException w:name="Plain Table 1" w:uiPriority="41"/>
     <w:lsdException w:name="Plain Table 2" w:uiPriority="42"/>
     <w:lsdException w:name="Plain Table 3" w:uiPriority="43"/>
@@ -11010,7 +11059,7 @@
     <w:lsdException w:name="Unresolved Mention" w:semiHidden="1" w:unhideWhenUsed="1"/>
     <w:lsdException w:name="Smart Link" w:semiHidden="1" w:unhideWhenUsed="1"/>
   </w:latentStyles>
-  <w:style w:type="paragraph" w:default="1" w:styleId="Normal">
+  <w:style w:type="paragraph" w:styleId="Normal" w:default="1">
     <w:name w:val="Normal"/>
     <w:qFormat/>
     <w:rsid w:val="00B67C91"/>
@@ -11030,7 +11079,7 @@
       <w:outlineLvl w:val="0"/>
     </w:pPr>
     <w:rPr>
-      <w:rFonts w:asciiTheme="majorHAnsi" w:eastAsiaTheme="majorEastAsia" w:hAnsiTheme="majorHAnsi" w:cstheme="majorBidi"/>
+      <w:rFonts w:asciiTheme="majorHAnsi" w:hAnsiTheme="majorHAnsi" w:eastAsiaTheme="majorEastAsia" w:cstheme="majorBidi"/>
       <w:color w:val="0F4761" w:themeColor="accent1" w:themeShade="BF"/>
       <w:sz w:val="40"/>
       <w:szCs w:val="40"/>
@@ -11053,7 +11102,7 @@
       <w:outlineLvl w:val="1"/>
     </w:pPr>
     <w:rPr>
-      <w:rFonts w:asciiTheme="majorHAnsi" w:eastAsiaTheme="majorEastAsia" w:hAnsiTheme="majorHAnsi" w:cstheme="majorBidi"/>
+      <w:rFonts w:asciiTheme="majorHAnsi" w:hAnsiTheme="majorHAnsi" w:eastAsiaTheme="majorEastAsia" w:cstheme="majorBidi"/>
       <w:color w:val="0F4761" w:themeColor="accent1" w:themeShade="BF"/>
       <w:sz w:val="32"/>
       <w:szCs w:val="32"/>
@@ -11214,13 +11263,13 @@
       <w:color w:val="272727" w:themeColor="text1" w:themeTint="D8"/>
     </w:rPr>
   </w:style>
-  <w:style w:type="character" w:default="1" w:styleId="DefaultParagraphFont">
+  <w:style w:type="character" w:styleId="DefaultParagraphFont" w:default="1">
     <w:name w:val="Default Paragraph Font"/>
     <w:uiPriority w:val="1"/>
     <w:semiHidden/>
     <w:unhideWhenUsed/>
   </w:style>
-  <w:style w:type="table" w:default="1" w:styleId="TableNormal">
+  <w:style w:type="table" w:styleId="TableNormal" w:default="1">
     <w:name w:val="Normal Table"/>
     <w:uiPriority w:val="99"/>
     <w:semiHidden/>
@@ -11235,26 +11284,26 @@
       </w:tblCellMar>
     </w:tblPr>
   </w:style>
-  <w:style w:type="numbering" w:default="1" w:styleId="NoList">
+  <w:style w:type="numbering" w:styleId="NoList" w:default="1">
     <w:name w:val="No List"/>
     <w:uiPriority w:val="99"/>
     <w:semiHidden/>
     <w:unhideWhenUsed/>
   </w:style>
-  <w:style w:type="character" w:customStyle="1" w:styleId="Heading1Char">
+  <w:style w:type="character" w:styleId="Heading1Char" w:customStyle="1">
     <w:name w:val="Heading 1 Char"/>
     <w:basedOn w:val="DefaultParagraphFont"/>
     <w:link w:val="Heading1"/>
     <w:uiPriority w:val="9"/>
     <w:rsid w:val="00B67C91"/>
     <w:rPr>
-      <w:rFonts w:asciiTheme="majorHAnsi" w:eastAsiaTheme="majorEastAsia" w:hAnsiTheme="majorHAnsi" w:cstheme="majorBidi"/>
+      <w:rFonts w:asciiTheme="majorHAnsi" w:hAnsiTheme="majorHAnsi" w:eastAsiaTheme="majorEastAsia" w:cstheme="majorBidi"/>
       <w:color w:val="0F4761" w:themeColor="accent1" w:themeShade="BF"/>
       <w:sz w:val="40"/>
       <w:szCs w:val="40"/>
     </w:rPr>
   </w:style>
-  <w:style w:type="character" w:customStyle="1" w:styleId="Heading2Char">
+  <w:style w:type="character" w:styleId="Heading2Char" w:customStyle="1">
     <w:name w:val="Heading 2 Char"/>
     <w:basedOn w:val="DefaultParagraphFont"/>
     <w:link w:val="Heading2"/>
@@ -11262,13 +11311,13 @@
     <w:semiHidden/>
     <w:rsid w:val="00B67C91"/>
     <w:rPr>
-      <w:rFonts w:asciiTheme="majorHAnsi" w:eastAsiaTheme="majorEastAsia" w:hAnsiTheme="majorHAnsi" w:cstheme="majorBidi"/>
+      <w:rFonts w:asciiTheme="majorHAnsi" w:hAnsiTheme="majorHAnsi" w:eastAsiaTheme="majorEastAsia" w:cstheme="majorBidi"/>
       <w:color w:val="0F4761" w:themeColor="accent1" w:themeShade="BF"/>
       <w:sz w:val="32"/>
       <w:szCs w:val="32"/>
     </w:rPr>
   </w:style>
-  <w:style w:type="character" w:customStyle="1" w:styleId="Heading3Char">
+  <w:style w:type="character" w:styleId="Heading3Char" w:customStyle="1">
     <w:name w:val="Heading 3 Char"/>
     <w:basedOn w:val="DefaultParagraphFont"/>
     <w:link w:val="Heading3"/>
@@ -11282,7 +11331,7 @@
       <w:szCs w:val="28"/>
     </w:rPr>
   </w:style>
-  <w:style w:type="character" w:customStyle="1" w:styleId="Heading4Char">
+  <w:style w:type="character" w:styleId="Heading4Char" w:customStyle="1">
     <w:name w:val="Heading 4 Char"/>
     <w:basedOn w:val="DefaultParagraphFont"/>
     <w:link w:val="Heading4"/>
@@ -11296,7 +11345,7 @@
       <w:color w:val="0F4761" w:themeColor="accent1" w:themeShade="BF"/>
     </w:rPr>
   </w:style>
-  <w:style w:type="character" w:customStyle="1" w:styleId="Heading5Char">
+  <w:style w:type="character" w:styleId="Heading5Char" w:customStyle="1">
     <w:name w:val="Heading 5 Char"/>
     <w:basedOn w:val="DefaultParagraphFont"/>
     <w:link w:val="Heading5"/>
@@ -11308,7 +11357,7 @@
       <w:color w:val="0F4761" w:themeColor="accent1" w:themeShade="BF"/>
     </w:rPr>
   </w:style>
-  <w:style w:type="character" w:customStyle="1" w:styleId="Heading6Char">
+  <w:style w:type="character" w:styleId="Heading6Char" w:customStyle="1">
     <w:name w:val="Heading 6 Char"/>
     <w:basedOn w:val="DefaultParagraphFont"/>
     <w:link w:val="Heading6"/>
@@ -11322,7 +11371,7 @@
       <w:color w:val="595959" w:themeColor="text1" w:themeTint="A6"/>
     </w:rPr>
   </w:style>
-  <w:style w:type="character" w:customStyle="1" w:styleId="Heading7Char">
+  <w:style w:type="character" w:styleId="Heading7Char" w:customStyle="1">
     <w:name w:val="Heading 7 Char"/>
     <w:basedOn w:val="DefaultParagraphFont"/>
     <w:link w:val="Heading7"/>
@@ -11334,7 +11383,7 @@
       <w:color w:val="595959" w:themeColor="text1" w:themeTint="A6"/>
     </w:rPr>
   </w:style>
-  <w:style w:type="character" w:customStyle="1" w:styleId="Heading8Char">
+  <w:style w:type="character" w:styleId="Heading8Char" w:customStyle="1">
     <w:name w:val="Heading 8 Char"/>
     <w:basedOn w:val="DefaultParagraphFont"/>
     <w:link w:val="Heading8"/>
@@ -11348,7 +11397,7 @@
       <w:color w:val="272727" w:themeColor="text1" w:themeTint="D8"/>
     </w:rPr>
   </w:style>
-  <w:style w:type="character" w:customStyle="1" w:styleId="Heading9Char">
+  <w:style w:type="character" w:styleId="Heading9Char" w:customStyle="1">
     <w:name w:val="Heading 9 Char"/>
     <w:basedOn w:val="DefaultParagraphFont"/>
     <w:link w:val="Heading9"/>
@@ -11373,21 +11422,21 @@
       <w:contextualSpacing/>
     </w:pPr>
     <w:rPr>
-      <w:rFonts w:asciiTheme="majorHAnsi" w:eastAsiaTheme="majorEastAsia" w:hAnsiTheme="majorHAnsi" w:cstheme="majorBidi"/>
+      <w:rFonts w:asciiTheme="majorHAnsi" w:hAnsiTheme="majorHAnsi" w:eastAsiaTheme="majorEastAsia" w:cstheme="majorBidi"/>
       <w:spacing w:val="-10"/>
       <w:kern w:val="28"/>
       <w:sz w:val="56"/>
       <w:szCs w:val="56"/>
     </w:rPr>
   </w:style>
-  <w:style w:type="character" w:customStyle="1" w:styleId="TitleChar">
+  <w:style w:type="character" w:styleId="TitleChar" w:customStyle="1">
     <w:name w:val="Title Char"/>
     <w:basedOn w:val="DefaultParagraphFont"/>
     <w:link w:val="Title"/>
     <w:uiPriority w:val="10"/>
     <w:rsid w:val="00B67C91"/>
     <w:rPr>
-      <w:rFonts w:asciiTheme="majorHAnsi" w:eastAsiaTheme="majorEastAsia" w:hAnsiTheme="majorHAnsi" w:cstheme="majorBidi"/>
+      <w:rFonts w:asciiTheme="majorHAnsi" w:hAnsiTheme="majorHAnsi" w:eastAsiaTheme="majorEastAsia" w:cstheme="majorBidi"/>
       <w:spacing w:val="-10"/>
       <w:kern w:val="28"/>
       <w:sz w:val="56"/>
@@ -11415,7 +11464,7 @@
       <w:szCs w:val="28"/>
     </w:rPr>
   </w:style>
-  <w:style w:type="character" w:customStyle="1" w:styleId="SubtitleChar">
+  <w:style w:type="character" w:styleId="SubtitleChar" w:customStyle="1">
     <w:name w:val="Subtitle Char"/>
     <w:basedOn w:val="DefaultParagraphFont"/>
     <w:link w:val="Subtitle"/>
@@ -11447,7 +11496,7 @@
       <w:color w:val="404040" w:themeColor="text1" w:themeTint="BF"/>
     </w:rPr>
   </w:style>
-  <w:style w:type="character" w:customStyle="1" w:styleId="QuoteChar">
+  <w:style w:type="character" w:styleId="QuoteChar" w:customStyle="1">
     <w:name w:val="Quote Char"/>
     <w:basedOn w:val="DefaultParagraphFont"/>
     <w:link w:val="Quote"/>
@@ -11492,8 +11541,8 @@
     <w:rsid w:val="00B67C91"/>
     <w:pPr>
       <w:pBdr>
-        <w:top w:val="single" w:sz="4" w:space="10" w:color="0F4761" w:themeColor="accent1" w:themeShade="BF"/>
-        <w:bottom w:val="single" w:sz="4" w:space="10" w:color="0F4761" w:themeColor="accent1" w:themeShade="BF"/>
+        <w:top w:val="single" w:color="0F4761" w:themeColor="accent1" w:themeShade="BF" w:sz="4" w:space="10"/>
+        <w:bottom w:val="single" w:color="0F4761" w:themeColor="accent1" w:themeShade="BF" w:sz="4" w:space="10"/>
       </w:pBdr>
       <w:spacing w:before="360" w:after="360"/>
       <w:ind w:left="864" w:right="864"/>
@@ -11505,7 +11554,7 @@
       <w:color w:val="0F4761" w:themeColor="accent1" w:themeShade="BF"/>
     </w:rPr>
   </w:style>
-  <w:style w:type="character" w:customStyle="1" w:styleId="IntenseQuoteChar">
+  <w:style w:type="character" w:styleId="IntenseQuoteChar" w:customStyle="1">
     <w:name w:val="Intense Quote Char"/>
     <w:basedOn w:val="DefaultParagraphFont"/>
     <w:link w:val="IntenseQuote"/>
@@ -11535,7 +11584,7 @@
 </file>
 
 <file path=word/theme/theme1.xml><?xml version="1.0" encoding="utf-8"?>
-<a:theme xmlns:a="http://schemas.openxmlformats.org/drawingml/2006/main" name="Office Theme">
+<a:theme xmlns:a="http://schemas.openxmlformats.org/drawingml/2006/main" xmlns:thm15="http://schemas.microsoft.com/office/thememl/2012/main" name="Office Theme">
   <a:themeElements>
     <a:clrScheme name="Office">
       <a:dk1>

</xml_diff>

<commit_message>
Aggiustati attori Casi d'uso
</commit_message>
<xml_diff>
--- a/Documents/Casi d'uso.docx
+++ b/Documents/Casi d'uso.docx
@@ -482,16 +482,385 @@
         <w:t>Attori:</w:t>
       </w:r>
       <w:r>
-        <w:rPr>
-          <w:b/>
-          <w:bCs/>
-        </w:rPr>
+        <w:t xml:space="preserve"> Utente registrato</w:t>
+      </w:r>
+      <w:r>
+        <w:t>.</w:t>
+      </w:r>
+    </w:p>
+    <w:p>
+      <w:r>
+        <w:rPr>
+          <w:b/>
+          <w:bCs/>
+        </w:rPr>
+        <w:t>Entry condition:</w:t>
+      </w:r>
+      <w:r>
         <w:t xml:space="preserve"> </w:t>
       </w:r>
       <w:r>
+        <w:t>L’</w:t>
+      </w:r>
+      <w:r>
+        <w:t>ut</w:t>
+      </w:r>
+      <w:r>
+        <w:t>ente registrato</w:t>
+      </w:r>
+      <w:r>
+        <w:t xml:space="preserve"> si trova nella pagina di accesso.</w:t>
+      </w:r>
+    </w:p>
+    <w:p>
+      <w:pPr>
+        <w:rPr>
+          <w:b/>
+          <w:bCs/>
+        </w:rPr>
+      </w:pPr>
+      <w:r>
+        <w:rPr>
+          <w:b/>
+          <w:bCs/>
+        </w:rPr>
+        <w:t>Flusso di eventi:</w:t>
+      </w:r>
+    </w:p>
+    <w:p>
+      <w:pPr>
+        <w:pStyle w:val="ListParagraph"/>
+        <w:numPr>
+          <w:ilvl w:val="0"/>
+          <w:numId w:val="17"/>
+        </w:numPr>
+      </w:pPr>
+      <w:r>
+        <w:t xml:space="preserve">L’utente registrato </w:t>
+      </w:r>
+      <w:r>
+        <w:t>inserisce e-mail e password.</w:t>
+      </w:r>
+    </w:p>
+    <w:p>
+      <w:pPr>
+        <w:pStyle w:val="ListParagraph"/>
+        <w:numPr>
+          <w:ilvl w:val="0"/>
+          <w:numId w:val="17"/>
+        </w:numPr>
+      </w:pPr>
+      <w:r>
+        <w:t>L’utente registrato</w:t>
+      </w:r>
+      <w:r>
+        <w:t xml:space="preserve"> </w:t>
+      </w:r>
+      <w:r>
+        <w:t>invia i dati al sistema.</w:t>
+      </w:r>
+    </w:p>
+    <w:p>
+      <w:pPr>
+        <w:pStyle w:val="ListParagraph"/>
+        <w:numPr>
+          <w:ilvl w:val="0"/>
+          <w:numId w:val="17"/>
+        </w:numPr>
+      </w:pPr>
+      <w:r>
+        <w:t>Il sistema controlla le credenziali e il controllo ha esito positivo.</w:t>
+      </w:r>
+    </w:p>
+    <w:p>
+      <w:pPr>
+        <w:pStyle w:val="ListParagraph"/>
+        <w:numPr>
+          <w:ilvl w:val="0"/>
+          <w:numId w:val="17"/>
+        </w:numPr>
+      </w:pPr>
+      <w:r>
+        <w:t xml:space="preserve">Il sistema crea la sessione e reindirizza </w:t>
+      </w:r>
+      <w:r>
+        <w:t>l’utente</w:t>
+      </w:r>
+      <w:r>
+        <w:t xml:space="preserve"> alla home page.</w:t>
+      </w:r>
+    </w:p>
+    <w:p>
+      <w:r>
+        <w:rPr>
+          <w:b/>
+          <w:bCs/>
+        </w:rPr>
+        <w:t>Exit condition:</w:t>
+      </w:r>
+      <w:r>
+        <w:t xml:space="preserve"> </w:t>
+      </w:r>
+      <w:r>
+        <w:t>L’utente registrato</w:t>
+      </w:r>
+      <w:r>
+        <w:t xml:space="preserve"> è autenticato e si trova sulla home page.</w:t>
+      </w:r>
+    </w:p>
+    <w:p>
+      <w:pPr>
+        <w:rPr>
+          <w:b/>
+          <w:bCs/>
+        </w:rPr>
+      </w:pPr>
+      <w:r>
+        <w:rPr>
+          <w:b/>
+          <w:bCs/>
+        </w:rPr>
+        <w:t>Flussi alternativi/Eccezioni</w:t>
+      </w:r>
+      <w:r>
+        <w:rPr>
+          <w:b/>
+          <w:bCs/>
+        </w:rPr>
+        <w:t>:</w:t>
+      </w:r>
+    </w:p>
+    <w:p>
+      <w:r>
+        <w:t>Se al passo 3 il sistema rileva delle credenziali non corrette, viene eseguito il caso d’uso UC</w:t>
+      </w:r>
+      <w:r>
+        <w:t>2</w:t>
+      </w:r>
+      <w:r>
+        <w:t>.1 – Credenziali non valide.</w:t>
+      </w:r>
+    </w:p>
+    <w:p>
+      <w:r>
+        <w:t>Se al passo 3 il sistema rileva che il lettore ha fatto l’accesso con una password provvisoria, viene eseguito il caso d’uso UC</w:t>
+      </w:r>
+      <w:r>
+        <w:t>2</w:t>
+      </w:r>
+      <w:r>
+        <w:t>.2 – Impostazione password</w:t>
+      </w:r>
+      <w:r>
+        <w:t xml:space="preserve"> permanente</w:t>
+      </w:r>
+      <w:r>
+        <w:t>.</w:t>
+      </w:r>
+    </w:p>
+    <w:p>
+      <w:pPr>
+        <w:rPr>
+          <w:b/>
+          <w:bCs/>
+          <w:sz w:val="28"/>
+          <w:szCs w:val="28"/>
+        </w:rPr>
+      </w:pPr>
+      <w:r>
+        <w:rPr>
+          <w:b/>
+          <w:bCs/>
+          <w:sz w:val="28"/>
+          <w:szCs w:val="28"/>
+        </w:rPr>
+        <w:t>UC</w:t>
+      </w:r>
+      <w:r>
+        <w:rPr>
+          <w:b/>
+          <w:bCs/>
+          <w:sz w:val="28"/>
+          <w:szCs w:val="28"/>
+        </w:rPr>
+        <w:t>2</w:t>
+      </w:r>
+      <w:r>
+        <w:rPr>
+          <w:b/>
+          <w:bCs/>
+          <w:sz w:val="28"/>
+          <w:szCs w:val="28"/>
+        </w:rPr>
+        <w:t>.1 – Credenziali non valide</w:t>
+      </w:r>
+    </w:p>
+    <w:p>
+      <w:r>
+        <w:rPr>
+          <w:b/>
+          <w:bCs/>
+        </w:rPr>
+        <w:t>Attori:</w:t>
+      </w:r>
+      <w:r>
+        <w:t xml:space="preserve"> Utente</w:t>
+      </w:r>
+      <w:r>
+        <w:t xml:space="preserve"> registrato</w:t>
+      </w:r>
+      <w:r>
+        <w:t>.</w:t>
+      </w:r>
+    </w:p>
+    <w:p>
+      <w:r>
+        <w:rPr>
+          <w:b/>
+          <w:bCs/>
+        </w:rPr>
+        <w:t>Entry condition:</w:t>
+      </w:r>
+      <w:r>
+        <w:t xml:space="preserve"> </w:t>
+      </w:r>
+      <w:r>
+        <w:t>L’utente registrato</w:t>
+      </w:r>
+      <w:r>
+        <w:t xml:space="preserve"> </w:t>
+      </w:r>
+      <w:r>
+        <w:t>ha provato ad autenticarsi e le credenziali non erano corrette.</w:t>
+      </w:r>
+    </w:p>
+    <w:p>
+      <w:pPr>
+        <w:rPr>
+          <w:b/>
+          <w:bCs/>
+        </w:rPr>
+      </w:pPr>
+      <w:r>
+        <w:rPr>
+          <w:b/>
+          <w:bCs/>
+        </w:rPr>
+        <w:t>Flusso di eventi:</w:t>
+      </w:r>
+    </w:p>
+    <w:p>
+      <w:pPr>
+        <w:pStyle w:val="ListParagraph"/>
+        <w:numPr>
+          <w:ilvl w:val="0"/>
+          <w:numId w:val="19"/>
+        </w:numPr>
+      </w:pPr>
+      <w:r>
+        <w:t>Il sistema mostra il messaggio di errore “Credenziali non valide”.</w:t>
+      </w:r>
+    </w:p>
+    <w:p>
+      <w:pPr>
+        <w:pStyle w:val="ListParagraph"/>
+        <w:numPr>
+          <w:ilvl w:val="0"/>
+          <w:numId w:val="19"/>
+        </w:numPr>
+      </w:pPr>
+      <w:r>
+        <w:t xml:space="preserve">Il sistema ripresenta </w:t>
+      </w:r>
+      <w:r>
+        <w:t>all’utente registrato</w:t>
+      </w:r>
+      <w:r>
+        <w:t xml:space="preserve"> la schermata di autenticazione.</w:t>
+      </w:r>
+    </w:p>
+    <w:p>
+      <w:r>
+        <w:t xml:space="preserve">Exit condition: </w:t>
+      </w:r>
+      <w:r>
+        <w:t>L’utente registrato</w:t>
+      </w:r>
+      <w:r>
+        <w:t xml:space="preserve"> si trova nella pagina di accesso.</w:t>
+      </w:r>
+    </w:p>
+    <w:p>
+      <w:pPr>
+        <w:rPr>
+          <w:b/>
+          <w:bCs/>
+          <w:sz w:val="28"/>
+          <w:szCs w:val="28"/>
+        </w:rPr>
+      </w:pPr>
+      <w:r>
+        <w:rPr>
+          <w:b/>
+          <w:bCs/>
+          <w:sz w:val="28"/>
+          <w:szCs w:val="28"/>
+        </w:rPr>
+        <w:t>UC</w:t>
+      </w:r>
+      <w:r>
+        <w:rPr>
+          <w:b/>
+          <w:bCs/>
+          <w:sz w:val="28"/>
+          <w:szCs w:val="28"/>
+        </w:rPr>
+        <w:t>2</w:t>
+      </w:r>
+      <w:r>
+        <w:rPr>
+          <w:b/>
+          <w:bCs/>
+          <w:sz w:val="28"/>
+          <w:szCs w:val="28"/>
+        </w:rPr>
+        <w:t>.2 – Impostazione password</w:t>
+      </w:r>
+      <w:r>
+        <w:rPr>
+          <w:b/>
+          <w:bCs/>
+          <w:sz w:val="28"/>
+          <w:szCs w:val="28"/>
+        </w:rPr>
+        <w:t xml:space="preserve"> permanente</w:t>
+      </w:r>
+    </w:p>
+    <w:p>
+      <w:r>
+        <w:rPr>
+          <w:b/>
+          <w:bCs/>
+        </w:rPr>
+        <w:t>Attori:</w:t>
+      </w:r>
+      <w:r>
+        <w:rPr>
+          <w:b/>
+          <w:bCs/>
+        </w:rPr>
+        <w:t xml:space="preserve"> </w:t>
+      </w:r>
+      <w:r>
         <w:t>Utente</w:t>
       </w:r>
       <w:r>
+        <w:t xml:space="preserve"> </w:t>
+      </w:r>
+      <w:r>
+        <w:t>registrato</w:t>
+      </w:r>
+      <w:r>
         <w:t>.</w:t>
       </w:r>
     </w:p>
@@ -507,10 +876,10 @@
         <w:t xml:space="preserve"> </w:t>
       </w:r>
       <w:r>
-        <w:t>L’utente</w:t>
-      </w:r>
-      <w:r>
-        <w:t xml:space="preserve"> si trova nella pagina di accesso.</w:t>
+        <w:t xml:space="preserve">L’utente registrato </w:t>
+      </w:r>
+      <w:r>
+        <w:t>ha effettuato l’accesso con una password provvisoria.</w:t>
       </w:r>
     </w:p>
     <w:p>
@@ -533,26 +902,38 @@
         <w:pStyle w:val="ListParagraph"/>
         <w:numPr>
           <w:ilvl w:val="0"/>
-          <w:numId w:val="17"/>
-        </w:numPr>
-      </w:pPr>
-      <w:r>
-        <w:t xml:space="preserve">L’utente </w:t>
-      </w:r>
-      <w:r>
-        <w:t>inserisce e-mail e password.</w:t>
-      </w:r>
-    </w:p>
-    <w:p>
-      <w:pPr>
-        <w:pStyle w:val="ListParagraph"/>
-        <w:numPr>
-          <w:ilvl w:val="0"/>
-          <w:numId w:val="17"/>
-        </w:numPr>
-      </w:pPr>
-      <w:r>
-        <w:t xml:space="preserve">L’utente </w:t>
+          <w:numId w:val="18"/>
+        </w:numPr>
+      </w:pPr>
+      <w:r>
+        <w:t>Il sistema reindirizza il lettore alla pagina di impostazione della password.</w:t>
+      </w:r>
+    </w:p>
+    <w:p>
+      <w:pPr>
+        <w:pStyle w:val="ListParagraph"/>
+        <w:numPr>
+          <w:ilvl w:val="0"/>
+          <w:numId w:val="18"/>
+        </w:numPr>
+      </w:pPr>
+      <w:r>
+        <w:t xml:space="preserve">L’utente registrato </w:t>
+      </w:r>
+      <w:r>
+        <w:t>inserisce la nuova password.</w:t>
+      </w:r>
+    </w:p>
+    <w:p>
+      <w:pPr>
+        <w:pStyle w:val="ListParagraph"/>
+        <w:numPr>
+          <w:ilvl w:val="0"/>
+          <w:numId w:val="18"/>
+        </w:numPr>
+      </w:pPr>
+      <w:r>
+        <w:t xml:space="preserve">L’utente registrato </w:t>
       </w:r>
       <w:r>
         <w:t>invia i dati al sistema.</w:t>
@@ -563,380 +944,42 @@
         <w:pStyle w:val="ListParagraph"/>
         <w:numPr>
           <w:ilvl w:val="0"/>
-          <w:numId w:val="17"/>
-        </w:numPr>
-      </w:pPr>
-      <w:r>
-        <w:t>Il sistema controlla le credenziali e il controllo ha esito positivo.</w:t>
-      </w:r>
-    </w:p>
-    <w:p>
-      <w:pPr>
-        <w:pStyle w:val="ListParagraph"/>
-        <w:numPr>
-          <w:ilvl w:val="0"/>
-          <w:numId w:val="17"/>
-        </w:numPr>
-      </w:pPr>
-      <w:r>
-        <w:t xml:space="preserve">Il sistema crea la sessione e reindirizza </w:t>
-      </w:r>
-      <w:r>
-        <w:t>l’utente</w:t>
-      </w:r>
-      <w:r>
-        <w:t xml:space="preserve"> alla home page.</w:t>
-      </w:r>
-    </w:p>
-    <w:p>
-      <w:r>
-        <w:rPr>
-          <w:b/>
-          <w:bCs/>
-        </w:rPr>
+          <w:numId w:val="18"/>
+        </w:numPr>
+      </w:pPr>
+      <w:r>
+        <w:t>Il sistema salva la nuova password nel database e lo stato diventa permanente.</w:t>
+      </w:r>
+    </w:p>
+    <w:p>
+      <w:pPr>
+        <w:pStyle w:val="ListParagraph"/>
+        <w:numPr>
+          <w:ilvl w:val="0"/>
+          <w:numId w:val="18"/>
+        </w:numPr>
+      </w:pPr>
+      <w:r>
+        <w:t>Il sistema reindirizza il lettore alla pagina di accesso.</w:t>
+      </w:r>
+    </w:p>
+    <w:p>
+      <w:r>
+        <w:rPr>
+          <w:b/>
+          <w:bCs/>
+        </w:rPr>
+        <w:lastRenderedPageBreak/>
         <w:t>Exit condition:</w:t>
       </w:r>
       <w:r>
         <w:t xml:space="preserve"> </w:t>
       </w:r>
       <w:r>
-        <w:t>L’utente</w:t>
-      </w:r>
-      <w:r>
-        <w:t xml:space="preserve"> è autenticato e si trova sulla home page.</w:t>
-      </w:r>
-    </w:p>
-    <w:p>
-      <w:pPr>
-        <w:rPr>
-          <w:b/>
-          <w:bCs/>
-        </w:rPr>
-      </w:pPr>
-      <w:r>
-        <w:rPr>
-          <w:b/>
-          <w:bCs/>
-        </w:rPr>
-        <w:t>Flussi alternativi/Eccezioni</w:t>
-      </w:r>
-      <w:r>
-        <w:rPr>
-          <w:b/>
-          <w:bCs/>
-        </w:rPr>
-        <w:t>:</w:t>
-      </w:r>
-    </w:p>
-    <w:p>
-      <w:r>
-        <w:t>Se al passo 3 il sistema rileva delle credenziali non corrette, viene eseguito il caso d’uso UC</w:t>
-      </w:r>
-      <w:r>
-        <w:t>2</w:t>
-      </w:r>
-      <w:r>
-        <w:t>.1 – Credenziali non valide.</w:t>
-      </w:r>
-    </w:p>
-    <w:p>
-      <w:r>
-        <w:t>Se al passo 3 il sistema rileva che il lettore ha fatto l’accesso con una password provvisoria, viene eseguito il caso d’uso UC</w:t>
-      </w:r>
-      <w:r>
-        <w:t>2</w:t>
-      </w:r>
-      <w:r>
-        <w:t>.2 – Impostazione password</w:t>
-      </w:r>
-      <w:r>
-        <w:t xml:space="preserve"> permanente</w:t>
-      </w:r>
-      <w:r>
-        <w:t>.</w:t>
-      </w:r>
-    </w:p>
-    <w:p>
-      <w:pPr>
-        <w:rPr>
-          <w:b/>
-          <w:bCs/>
-          <w:sz w:val="28"/>
-          <w:szCs w:val="28"/>
-        </w:rPr>
-      </w:pPr>
-      <w:r>
-        <w:rPr>
-          <w:b/>
-          <w:bCs/>
-          <w:sz w:val="28"/>
-          <w:szCs w:val="28"/>
-        </w:rPr>
-        <w:t>UC</w:t>
-      </w:r>
-      <w:r>
-        <w:rPr>
-          <w:b/>
-          <w:bCs/>
-          <w:sz w:val="28"/>
-          <w:szCs w:val="28"/>
-        </w:rPr>
-        <w:t>2</w:t>
-      </w:r>
-      <w:r>
-        <w:rPr>
-          <w:b/>
-          <w:bCs/>
-          <w:sz w:val="28"/>
-          <w:szCs w:val="28"/>
-        </w:rPr>
-        <w:t>.1 – Credenziali non valide</w:t>
-      </w:r>
-    </w:p>
-    <w:p>
-      <w:r>
-        <w:rPr>
-          <w:b/>
-          <w:bCs/>
-        </w:rPr>
-        <w:t>Attori:</w:t>
-      </w:r>
-      <w:r>
-        <w:t xml:space="preserve"> </w:t>
-      </w:r>
-      <w:r>
-        <w:t>U</w:t>
-      </w:r>
-      <w:r>
-        <w:t>tente</w:t>
-      </w:r>
-      <w:r>
-        <w:t>.</w:t>
-      </w:r>
-    </w:p>
-    <w:p>
-      <w:r>
-        <w:rPr>
-          <w:b/>
-          <w:bCs/>
-        </w:rPr>
-        <w:t>Entry condition:</w:t>
-      </w:r>
-      <w:r>
-        <w:t xml:space="preserve"> </w:t>
-      </w:r>
-      <w:r>
-        <w:t xml:space="preserve">L’utente </w:t>
-      </w:r>
-      <w:r>
-        <w:t>ha provato ad autenticarsi e le credenziali non erano corrette.</w:t>
-      </w:r>
-    </w:p>
-    <w:p>
-      <w:pPr>
-        <w:rPr>
-          <w:b/>
-          <w:bCs/>
-        </w:rPr>
-      </w:pPr>
-      <w:r>
-        <w:rPr>
-          <w:b/>
-          <w:bCs/>
-        </w:rPr>
-        <w:t>Flusso di eventi:</w:t>
-      </w:r>
-    </w:p>
-    <w:p>
-      <w:pPr>
-        <w:pStyle w:val="ListParagraph"/>
-        <w:numPr>
-          <w:ilvl w:val="0"/>
-          <w:numId w:val="19"/>
-        </w:numPr>
-      </w:pPr>
-      <w:r>
-        <w:t>Il sistema mostra il messaggio di errore “Credenziali non valide”.</w:t>
-      </w:r>
-    </w:p>
-    <w:p>
-      <w:pPr>
-        <w:pStyle w:val="ListParagraph"/>
-        <w:numPr>
-          <w:ilvl w:val="0"/>
-          <w:numId w:val="19"/>
-        </w:numPr>
-      </w:pPr>
-      <w:r>
-        <w:t>Il sistema ripresenta al lettore la schermata di autenticazione.</w:t>
-      </w:r>
-    </w:p>
-    <w:p>
-      <w:r>
-        <w:t>Exit condition: Il lettore si trova nella pagina di accesso.</w:t>
-      </w:r>
-    </w:p>
-    <w:p>
-      <w:pPr>
-        <w:rPr>
-          <w:b/>
-          <w:bCs/>
-          <w:sz w:val="28"/>
-          <w:szCs w:val="28"/>
-        </w:rPr>
-      </w:pPr>
-      <w:r>
-        <w:rPr>
-          <w:b/>
-          <w:bCs/>
-          <w:sz w:val="28"/>
-          <w:szCs w:val="28"/>
-        </w:rPr>
-        <w:t>UC</w:t>
-      </w:r>
-      <w:r>
-        <w:rPr>
-          <w:b/>
-          <w:bCs/>
-          <w:sz w:val="28"/>
-          <w:szCs w:val="28"/>
-        </w:rPr>
-        <w:t>2</w:t>
-      </w:r>
-      <w:r>
-        <w:rPr>
-          <w:b/>
-          <w:bCs/>
-          <w:sz w:val="28"/>
-          <w:szCs w:val="28"/>
-        </w:rPr>
-        <w:t>.2 – Impostazione password</w:t>
-      </w:r>
-      <w:r>
-        <w:rPr>
-          <w:b/>
-          <w:bCs/>
-          <w:sz w:val="28"/>
-          <w:szCs w:val="28"/>
-        </w:rPr>
-        <w:t xml:space="preserve"> permanente</w:t>
-      </w:r>
-    </w:p>
-    <w:p>
-      <w:r>
-        <w:rPr>
-          <w:b/>
-          <w:bCs/>
-        </w:rPr>
-        <w:t>Attori:</w:t>
-      </w:r>
-      <w:r>
-        <w:t xml:space="preserve"> Lettore</w:t>
-      </w:r>
-      <w:r>
-        <w:t xml:space="preserve"> autenticato</w:t>
-      </w:r>
-      <w:r>
-        <w:t>.</w:t>
-      </w:r>
-    </w:p>
-    <w:p>
-      <w:r>
-        <w:rPr>
-          <w:b/>
-          <w:bCs/>
-        </w:rPr>
-        <w:t>Entry condition:</w:t>
-      </w:r>
-      <w:r>
-        <w:t xml:space="preserve"> Il lettore ha effettuato l’accesso con una password provvisoria.</w:t>
-      </w:r>
-    </w:p>
-    <w:p>
-      <w:pPr>
-        <w:rPr>
-          <w:b/>
-          <w:bCs/>
-        </w:rPr>
-      </w:pPr>
-      <w:r>
-        <w:rPr>
-          <w:b/>
-          <w:bCs/>
-        </w:rPr>
-        <w:t>Flusso di eventi:</w:t>
-      </w:r>
-    </w:p>
-    <w:p>
-      <w:pPr>
-        <w:pStyle w:val="ListParagraph"/>
-        <w:numPr>
-          <w:ilvl w:val="0"/>
-          <w:numId w:val="18"/>
-        </w:numPr>
-      </w:pPr>
-      <w:r>
-        <w:t>Il sistema reindirizza il lettore alla pagina di impostazione della password.</w:t>
-      </w:r>
-    </w:p>
-    <w:p>
-      <w:pPr>
-        <w:pStyle w:val="ListParagraph"/>
-        <w:numPr>
-          <w:ilvl w:val="0"/>
-          <w:numId w:val="18"/>
-        </w:numPr>
-      </w:pPr>
-      <w:r>
-        <w:t>Il lettore inserisce la nuova password.</w:t>
-      </w:r>
-    </w:p>
-    <w:p>
-      <w:pPr>
-        <w:pStyle w:val="ListParagraph"/>
-        <w:numPr>
-          <w:ilvl w:val="0"/>
-          <w:numId w:val="18"/>
-        </w:numPr>
-      </w:pPr>
-      <w:r>
-        <w:t>Il lettore invia i dati al sistema.</w:t>
-      </w:r>
-    </w:p>
-    <w:p>
-      <w:pPr>
-        <w:pStyle w:val="ListParagraph"/>
-        <w:numPr>
-          <w:ilvl w:val="0"/>
-          <w:numId w:val="18"/>
-        </w:numPr>
-      </w:pPr>
-      <w:r>
-        <w:t>Il sistema salva la nuova password nel database e lo stato diventa permanente.</w:t>
-      </w:r>
-    </w:p>
-    <w:p>
-      <w:pPr>
-        <w:pStyle w:val="ListParagraph"/>
-        <w:numPr>
-          <w:ilvl w:val="0"/>
-          <w:numId w:val="18"/>
-        </w:numPr>
-      </w:pPr>
-      <w:r>
-        <w:t>Il sistema reindirizza il lettore alla pagina di accesso.</w:t>
-      </w:r>
-    </w:p>
-    <w:p>
-      <w:r>
-        <w:rPr>
-          <w:b/>
-          <w:bCs/>
-        </w:rPr>
-        <w:t>Exit condition:</w:t>
-      </w:r>
-      <w:r>
-        <w:t xml:space="preserve"> Il lettore si trova nella pagina di accesso e la sua password è stata modificata.</w:t>
+        <w:t xml:space="preserve">L’utente registrato </w:t>
+      </w:r>
+      <w:r>
+        <w:t>si trova nella pagina di accesso e la sua password è stata modificata.</w:t>
       </w:r>
     </w:p>
     <w:p>
@@ -984,7 +1027,7 @@
         <w:t xml:space="preserve"> </w:t>
       </w:r>
       <w:r>
-        <w:t>Utente</w:t>
+        <w:t>Utente registrato</w:t>
       </w:r>
       <w:r>
         <w:t>.</w:t>
@@ -1005,6 +1048,12 @@
         <w:t xml:space="preserve">L’utente </w:t>
       </w:r>
       <w:r>
+        <w:t>registrato</w:t>
+      </w:r>
+      <w:r>
+        <w:t xml:space="preserve"> </w:t>
+      </w:r>
+      <w:r>
         <w:t>è autenticato.</w:t>
       </w:r>
     </w:p>
@@ -1032,7 +1081,13 @@
         </w:numPr>
       </w:pPr>
       <w:r>
-        <w:t xml:space="preserve">L’utente </w:t>
+        <w:t>L’utente</w:t>
+      </w:r>
+      <w:r>
+        <w:t xml:space="preserve"> registrato</w:t>
+      </w:r>
+      <w:r>
+        <w:t xml:space="preserve"> </w:t>
       </w:r>
       <w:r>
         <w:t>preme sul pulsante “Logout”.</w:t>
@@ -1071,6 +1126,12 @@
         <w:t xml:space="preserve"> </w:t>
       </w:r>
       <w:r>
+        <w:t>registrato</w:t>
+      </w:r>
+      <w:r>
+        <w:t xml:space="preserve"> </w:t>
+      </w:r>
+      <w:r>
         <w:t>alla home page.</w:t>
       </w:r>
     </w:p>
@@ -1087,6 +1148,12 @@
       </w:r>
       <w:r>
         <w:t>L’utente</w:t>
+      </w:r>
+      <w:r>
+        <w:t xml:space="preserve"> </w:t>
+      </w:r>
+      <w:r>
+        <w:t>registrato</w:t>
       </w:r>
       <w:r>
         <w:t xml:space="preserve"> </w:t>
@@ -1182,124 +1249,115 @@
         <w:t xml:space="preserve"> </w:t>
       </w:r>
       <w:r>
-        <w:t>L’utente</w:t>
+        <w:t xml:space="preserve">L’utente </w:t>
+      </w:r>
+      <w:r>
+        <w:t>si trova nella pagina del</w:t>
+      </w:r>
+      <w:r>
+        <w:t xml:space="preserve"> catalogo</w:t>
+      </w:r>
+      <w:r>
+        <w:t>.</w:t>
+      </w:r>
+    </w:p>
+    <w:p>
+      <w:pPr>
+        <w:rPr>
+          <w:b/>
+          <w:bCs/>
+        </w:rPr>
+      </w:pPr>
+      <w:r>
+        <w:rPr>
+          <w:b/>
+          <w:bCs/>
+        </w:rPr>
+        <w:t>Flusso di eventi:</w:t>
+      </w:r>
+    </w:p>
+    <w:p>
+      <w:pPr>
+        <w:pStyle w:val="ListParagraph"/>
+        <w:numPr>
+          <w:ilvl w:val="0"/>
+          <w:numId w:val="5"/>
+        </w:numPr>
+      </w:pPr>
+      <w:r>
+        <w:t xml:space="preserve">L’utente </w:t>
+      </w:r>
+      <w:r>
+        <w:t>cerca l’edizione</w:t>
+      </w:r>
+      <w:r>
+        <w:t xml:space="preserve"> i </w:t>
+      </w:r>
+      <w:r>
+        <w:t>filtri</w:t>
+      </w:r>
+      <w:r>
+        <w:t xml:space="preserve"> di ricerca</w:t>
+      </w:r>
+      <w:r>
+        <w:t>.</w:t>
+      </w:r>
+    </w:p>
+    <w:p>
+      <w:pPr>
+        <w:pStyle w:val="ListParagraph"/>
+        <w:numPr>
+          <w:ilvl w:val="0"/>
+          <w:numId w:val="5"/>
+        </w:numPr>
+      </w:pPr>
+      <w:r>
+        <w:t>Clicca il tasto “Applica”.</w:t>
+      </w:r>
+    </w:p>
+    <w:p>
+      <w:pPr>
+        <w:pStyle w:val="ListParagraph"/>
+        <w:numPr>
+          <w:ilvl w:val="0"/>
+          <w:numId w:val="5"/>
+        </w:numPr>
+      </w:pPr>
+      <w:r>
+        <w:t>Il sistema applica i filtri e mostra i risultati pertinenti.</w:t>
+      </w:r>
+    </w:p>
+    <w:p>
+      <w:pPr>
+        <w:pStyle w:val="ListParagraph"/>
+        <w:numPr>
+          <w:ilvl w:val="0"/>
+          <w:numId w:val="5"/>
+        </w:numPr>
+      </w:pPr>
+      <w:r>
+        <w:t xml:space="preserve">L’utente </w:t>
+      </w:r>
+      <w:r>
+        <w:t>seleziona un’edizione.</w:t>
+      </w:r>
+    </w:p>
+    <w:p>
+      <w:r>
+        <w:rPr>
+          <w:b/>
+          <w:bCs/>
+        </w:rPr>
+        <w:t>Exit condition:</w:t>
       </w:r>
       <w:r>
         <w:t xml:space="preserve"> </w:t>
       </w:r>
       <w:r>
-        <w:t>si trova nella pagina del</w:t>
-      </w:r>
-      <w:r>
-        <w:t xml:space="preserve"> catalogo</w:t>
+        <w:t>L’utente si trova nella pagina dell’edizione</w:t>
       </w:r>
       <w:r>
         <w:t>.</w:t>
-      </w:r>
-    </w:p>
-    <w:p>
-      <w:pPr>
-        <w:rPr>
-          <w:b/>
-          <w:bCs/>
-        </w:rPr>
-      </w:pPr>
-      <w:r>
-        <w:rPr>
-          <w:b/>
-          <w:bCs/>
-        </w:rPr>
-        <w:t>Flusso di eventi:</w:t>
-      </w:r>
-    </w:p>
-    <w:p>
-      <w:pPr>
-        <w:pStyle w:val="ListParagraph"/>
-        <w:numPr>
-          <w:ilvl w:val="0"/>
-          <w:numId w:val="5"/>
-        </w:numPr>
-      </w:pPr>
-      <w:r>
-        <w:t>L’utente</w:t>
-      </w:r>
-      <w:r>
-        <w:t xml:space="preserve"> </w:t>
-      </w:r>
-      <w:r>
-        <w:t>cerca l’edizione</w:t>
-      </w:r>
-      <w:r>
-        <w:t xml:space="preserve"> i </w:t>
-      </w:r>
-      <w:r>
-        <w:t>filtri</w:t>
-      </w:r>
-      <w:r>
-        <w:t xml:space="preserve"> di ricerca</w:t>
-      </w:r>
-      <w:r>
-        <w:t>.</w:t>
-      </w:r>
-    </w:p>
-    <w:p>
-      <w:pPr>
-        <w:pStyle w:val="ListParagraph"/>
-        <w:numPr>
-          <w:ilvl w:val="0"/>
-          <w:numId w:val="5"/>
-        </w:numPr>
-      </w:pPr>
-      <w:r>
-        <w:t>Clicca il tasto “Applica”.</w:t>
-      </w:r>
-    </w:p>
-    <w:p>
-      <w:pPr>
-        <w:pStyle w:val="ListParagraph"/>
-        <w:numPr>
-          <w:ilvl w:val="0"/>
-          <w:numId w:val="5"/>
-        </w:numPr>
-      </w:pPr>
-      <w:r>
-        <w:t>Il sistema applica i filtri e mostra i risultati pertinenti.</w:t>
-      </w:r>
-    </w:p>
-    <w:p>
-      <w:pPr>
-        <w:pStyle w:val="ListParagraph"/>
-        <w:numPr>
-          <w:ilvl w:val="0"/>
-          <w:numId w:val="5"/>
-        </w:numPr>
-      </w:pPr>
-      <w:r>
-        <w:t>L’utente</w:t>
-      </w:r>
-      <w:r>
-        <w:t xml:space="preserve"> </w:t>
-      </w:r>
-      <w:r>
-        <w:t>seleziona un’edizione.</w:t>
-      </w:r>
-    </w:p>
-    <w:p>
-      <w:r>
-        <w:rPr>
-          <w:b/>
-          <w:bCs/>
-        </w:rPr>
-        <w:t>Exit condition:</w:t>
-      </w:r>
-      <w:r>
-        <w:t xml:space="preserve"> Il sistema mostra i dettagli relativi all’edizione quali: autor</w:t>
-      </w:r>
-      <w:r>
-        <w:t>i</w:t>
-      </w:r>
-      <w:r>
-        <w:t>, edizione, e numero di copie disponibili.</w:t>
       </w:r>
       <w:r>
         <w:rPr>
@@ -1331,7 +1389,13 @@
         <w:t xml:space="preserve"> Lettore</w:t>
       </w:r>
       <w:r>
-        <w:t xml:space="preserve"> autenticato.</w:t>
+        <w:t xml:space="preserve"> </w:t>
+      </w:r>
+      <w:r>
+        <w:t>registrato</w:t>
+      </w:r>
+      <w:r>
+        <w:t>.</w:t>
       </w:r>
     </w:p>
     <w:p>
@@ -1352,12 +1416,15 @@
         <w:t>l lettore</w:t>
       </w:r>
       <w:r>
-        <w:t xml:space="preserve"> autenticato</w:t>
-      </w:r>
-      <w:r>
         <w:t xml:space="preserve"> </w:t>
       </w:r>
       <w:r>
+        <w:t>registrato è autenticato e</w:t>
+      </w:r>
+      <w:r>
+        <w:t xml:space="preserve"> </w:t>
+      </w:r>
+      <w:r>
         <w:t>si trova nella</w:t>
       </w:r>
       <w:r>
@@ -1615,6 +1682,9 @@
         <w:t xml:space="preserve"> Lettore</w:t>
       </w:r>
       <w:r>
+        <w:t xml:space="preserve"> registrato</w:t>
+      </w:r>
+      <w:r>
         <w:t>.</w:t>
       </w:r>
     </w:p>
@@ -1630,7 +1700,13 @@
         <w:t xml:space="preserve"> </w:t>
       </w:r>
       <w:r>
-        <w:t>Il lettore ha provato ad effettuare una prenotazione ma la sessione è scaduta.</w:t>
+        <w:t xml:space="preserve">Il lettore </w:t>
+      </w:r>
+      <w:r>
+        <w:t xml:space="preserve">registrato </w:t>
+      </w:r>
+      <w:r>
+        <w:t>ha provato ad effettuare una prenotazione ma la sessione è scaduta.</w:t>
       </w:r>
     </w:p>
     <w:p>
@@ -1656,7 +1732,13 @@
         </w:numPr>
       </w:pPr>
       <w:r>
-        <w:t>Il sistema porta il lettore alla pagina di accesso.</w:t>
+        <w:t xml:space="preserve">Il sistema porta il </w:t>
+      </w:r>
+      <w:r>
+        <w:t xml:space="preserve">lettore registrato </w:t>
+      </w:r>
+      <w:r>
+        <w:t>alla pagina di accesso.</w:t>
       </w:r>
     </w:p>
     <w:p>
@@ -1671,7 +1753,13 @@
         <w:t xml:space="preserve"> </w:t>
       </w:r>
       <w:r>
-        <w:t>Il lettore si trova nella pagina di accesso.</w:t>
+        <w:t xml:space="preserve">Il </w:t>
+      </w:r>
+      <w:r>
+        <w:t>lettore registrato</w:t>
+      </w:r>
+      <w:r>
+        <w:t xml:space="preserve"> si trova nella pagina di accesso.</w:t>
       </w:r>
     </w:p>
     <w:p>
@@ -1703,7 +1791,13 @@
         <w:t xml:space="preserve"> Lettore</w:t>
       </w:r>
       <w:r>
-        <w:t xml:space="preserve"> autenticato.</w:t>
+        <w:t xml:space="preserve"> </w:t>
+      </w:r>
+      <w:r>
+        <w:t>registrato</w:t>
+      </w:r>
+      <w:r>
+        <w:t>.</w:t>
       </w:r>
     </w:p>
     <w:p>
@@ -1718,7 +1812,13 @@
         <w:t xml:space="preserve"> </w:t>
       </w:r>
       <w:r>
-        <w:t>Il lettore ha provato ad effettuare una prenotazione ma è attiva una sospensione a suo nome.</w:t>
+        <w:t>Il lettore</w:t>
+      </w:r>
+      <w:r>
+        <w:t xml:space="preserve"> registrato è autenticato e</w:t>
+      </w:r>
+      <w:r>
+        <w:t xml:space="preserve"> ha provato ad effettuare una prenotazione ma è attiva una sospensione a suo nome.</w:t>
       </w:r>
     </w:p>
     <w:p>
@@ -1760,7 +1860,13 @@
         <w:t xml:space="preserve"> </w:t>
       </w:r>
       <w:r>
-        <w:t>Il lettore resta nella pagina dell’edizione.</w:t>
+        <w:t xml:space="preserve">Il </w:t>
+      </w:r>
+      <w:r>
+        <w:t xml:space="preserve">lettore registrato </w:t>
+      </w:r>
+      <w:r>
+        <w:t>resta nella pagina dell’edizione.</w:t>
       </w:r>
     </w:p>
     <w:p>
@@ -1818,7 +1924,13 @@
         <w:t>Attori:</w:t>
       </w:r>
       <w:r>
-        <w:t xml:space="preserve"> Lettore autenticato.</w:t>
+        <w:t xml:space="preserve"> Lettore </w:t>
+      </w:r>
+      <w:r>
+        <w:t>registrato</w:t>
+      </w:r>
+      <w:r>
+        <w:t>.</w:t>
       </w:r>
     </w:p>
     <w:p>
@@ -1830,7 +1942,13 @@
         <w:t>Entry condition:</w:t>
       </w:r>
       <w:r>
-        <w:t xml:space="preserve"> Il lettore ha provato ad effettuare una prenotazione ma ha già tre o più prenotazioni attive.</w:t>
+        <w:t xml:space="preserve"> Il lettore</w:t>
+      </w:r>
+      <w:r>
+        <w:t xml:space="preserve"> registrato è autenticato e</w:t>
+      </w:r>
+      <w:r>
+        <w:t xml:space="preserve"> ha provato ad effettuare una prenotazione ma ha già tre o più prenotazioni attive.</w:t>
       </w:r>
     </w:p>
     <w:p>
@@ -1869,7 +1987,13 @@
         <w:t>Exit condition:</w:t>
       </w:r>
       <w:r>
-        <w:t xml:space="preserve"> Il lettore resta nella pagina dell’edizione.</w:t>
+        <w:t xml:space="preserve"> Il </w:t>
+      </w:r>
+      <w:r>
+        <w:t>lettore registrato</w:t>
+      </w:r>
+      <w:r>
+        <w:t xml:space="preserve"> resta nella pagina dell’edizione.</w:t>
       </w:r>
     </w:p>
     <w:p>
@@ -1927,7 +2051,13 @@
         <w:t>Attori:</w:t>
       </w:r>
       <w:r>
-        <w:t xml:space="preserve"> Lettore autenticato.</w:t>
+        <w:t xml:space="preserve"> Lettore </w:t>
+      </w:r>
+      <w:r>
+        <w:t>registrato</w:t>
+      </w:r>
+      <w:r>
+        <w:t>.</w:t>
       </w:r>
     </w:p>
     <w:p>
@@ -1939,7 +2069,16 @@
         <w:t>Entry condition:</w:t>
       </w:r>
       <w:r>
-        <w:t xml:space="preserve"> Il lettore ha provato ad effettuare una prenotazione ma non ci sono copie disponibili.</w:t>
+        <w:t xml:space="preserve"> Il lettore</w:t>
+      </w:r>
+      <w:r>
+        <w:t xml:space="preserve"> registrato è autenticato</w:t>
+      </w:r>
+      <w:r>
+        <w:t xml:space="preserve"> e</w:t>
+      </w:r>
+      <w:r>
+        <w:t xml:space="preserve"> ha provato ad effettuare una prenotazione ma non ci sono copie disponibili.</w:t>
       </w:r>
     </w:p>
     <w:p>
@@ -1978,7 +2117,13 @@
         <w:t>Exit condition:</w:t>
       </w:r>
       <w:r>
-        <w:t xml:space="preserve"> Il lettore resta nella pagina dell’edizione.</w:t>
+        <w:t xml:space="preserve"> Il </w:t>
+      </w:r>
+      <w:r>
+        <w:t xml:space="preserve">lettore registrato </w:t>
+      </w:r>
+      <w:r>
+        <w:t>resta nella pagina dell’edizione.</w:t>
       </w:r>
     </w:p>
     <w:p>
@@ -2048,7 +2193,10 @@
         <w:t xml:space="preserve"> </w:t>
       </w:r>
       <w:r>
-        <w:t>Lettore autenticato</w:t>
+        <w:t xml:space="preserve">Lettore </w:t>
+      </w:r>
+      <w:r>
+        <w:t>registrato</w:t>
       </w:r>
       <w:r>
         <w:t>.</w:t>
@@ -2066,10 +2214,13 @@
         <w:t xml:space="preserve"> </w:t>
       </w:r>
       <w:r>
-        <w:t>Il lettore autenticato</w:t>
-      </w:r>
-      <w:r>
-        <w:t xml:space="preserve"> accede alla pagina di gestione </w:t>
+        <w:t xml:space="preserve">Il lettore </w:t>
+      </w:r>
+      <w:r>
+        <w:t xml:space="preserve">registrato è autenticato e </w:t>
+      </w:r>
+      <w:r>
+        <w:t xml:space="preserve">accede alla pagina di gestione </w:t>
       </w:r>
       <w:r>
         <w:t xml:space="preserve">delle </w:t>
@@ -2105,7 +2256,13 @@
         </w:numPr>
       </w:pPr>
       <w:r>
-        <w:t>Il lettore seleziona la prenotazione che vuole annullare.</w:t>
+        <w:t>Il lettore</w:t>
+      </w:r>
+      <w:r>
+        <w:t xml:space="preserve"> registrato</w:t>
+      </w:r>
+      <w:r>
+        <w:t xml:space="preserve"> seleziona la prenotazione che vuole annullare.</w:t>
       </w:r>
     </w:p>
     <w:p>
@@ -2168,7 +2325,13 @@
         <w:t xml:space="preserve"> </w:t>
       </w:r>
       <w:r>
-        <w:t>Il lettore autenticato viene riportato nella pagina di gestione delle prenotazioni e la prenotazione è stata rimossa dal database.</w:t>
+        <w:t xml:space="preserve">Il </w:t>
+      </w:r>
+      <w:r>
+        <w:t>lettore registrato</w:t>
+      </w:r>
+      <w:r>
+        <w:t xml:space="preserve"> viene riportato nella pagina di gestione delle prenotazioni e la prenotazione è stata rimossa dal database.</w:t>
       </w:r>
     </w:p>
     <w:p>
@@ -4181,10 +4344,7 @@
         <w:t>Entry condition:</w:t>
       </w:r>
       <w:r>
-        <w:t xml:space="preserve"> L’operatore ha inserito delle informazioni non valide nella </w:t>
-      </w:r>
-      <w:r>
-        <w:t>ricerca di un lettore.</w:t>
+        <w:t xml:space="preserve"> L’operatore ha inserito delle informazioni non valide nella ricerca di un lettore.</w:t>
       </w:r>
     </w:p>
     <w:p>

</xml_diff>